<commit_message>
feat: AAC chapter SOPs as plain-body + audit appendix (one file)
Converts all 11 AAC SOPs to the same format approved for FMS and ROM:
plain-language body with safety-consequence-framed "Why:" reasoning and
zero inline NABH codes, page break, then an Appendix with OE codes,
boundary notes, and verified hyperlinked sources. No existing build
script existed for AAC, so a new build_aac_sops_v2.py was written from
the live docx content and verified citation URLs. Records untouched.

Co-Authored-By: Claude Sonnet 5 <noreply@anthropic.com>
Claude-Session: https://claude.ai/code/session_016VFLsECWt4VArpBiaqgrgF
</commit_message>
<xml_diff>
--- a/policies/build/sop_record_masters/AAC/SOP_AAC.1.c_scope_of_services.docx
+++ b/policies/build/sop_record_masters/AAC/SOP_AAC.1.c_scope_of_services.docx
@@ -14,40 +14,9 @@
     </w:p>
     <w:p>
       <w:r>
-        <w:t>«Hospital Name» — Supports AAC.1.c</w:t>
+        <w:t>«Hospital Name» — SOP-AAC.1.c — Version 1.0</w:t>
       </w:r>
     </w:p>
-    <w:p/>
-    <w:tbl>
-      <w:tblPr>
-        <w:tblStyle w:val="TableGrid"/>
-        <w:tblW w:type="auto" w:w="0"/>
-        <w:tblLook w:firstColumn="1" w:firstRow="1" w:lastColumn="0" w:lastRow="0" w:noHBand="0" w:noVBand="1" w:val="04A0"/>
-      </w:tblPr>
-      <w:tblGrid>
-        <w:gridCol w:w="8640"/>
-      </w:tblGrid>
-      <w:tr>
-        <w:tc>
-          <w:tcPr>
-            <w:tcW w:type="dxa" w:w="8640"/>
-          </w:tcPr>
-          <w:p>
-            <w:r>
-              <w:rPr>
-                <w:b/>
-              </w:rPr>
-              <w:t>Why does this SOP exist? (read this first if you're new)</w:t>
-            </w:r>
-          </w:p>
-          <w:p>
-            <w:r>
-              <w:t>This SOP explains how «Hospital Name» defines what each department actually does, and what happens when a patient needs something it doesn't do. If you're new to this SOP: a scope statement only counts once it is written down, approved, reached the people who decide whether to admit a patient, and has a documented path for the patient when the answer is no.</w:t>
-            </w:r>
-          </w:p>
-        </w:tc>
-      </w:tr>
-    </w:tbl>
     <w:p/>
     <w:tbl>
       <w:tblPr>
@@ -62,9 +31,6 @@
         <w:gridCol w:w="2160"/>
       </w:tblGrid>
       <w:tr>
-        <w:trPr>
-          <w:cantSplit/>
-        </w:trPr>
         <w:tc>
           <w:tcPr>
             <w:tcW w:type="dxa" w:w="2160"/>
@@ -81,7 +47,7 @@
           </w:tcPr>
           <w:p>
             <w:r>
-              <w:t>«Hospital to define»</w:t>
+              <w:t>SOP-AAC.1.c</w:t>
             </w:r>
           </w:p>
         </w:tc>
@@ -107,9 +73,6 @@
         </w:tc>
       </w:tr>
       <w:tr>
-        <w:trPr>
-          <w:cantSplit/>
-        </w:trPr>
         <w:tc>
           <w:tcPr>
             <w:tcW w:type="dxa" w:w="2160"/>
@@ -151,51 +114,6 @@
           </w:p>
         </w:tc>
       </w:tr>
-      <w:tr>
-        <w:trPr>
-          <w:cantSplit/>
-        </w:trPr>
-        <w:tc>
-          <w:tcPr>
-            <w:tcW w:type="dxa" w:w="2160"/>
-          </w:tcPr>
-          <w:p>
-            <w:r>
-              <w:t>Prepared By</w:t>
-            </w:r>
-          </w:p>
-        </w:tc>
-        <w:tc>
-          <w:tcPr>
-            <w:tcW w:type="dxa" w:w="2160"/>
-          </w:tcPr>
-          <w:p>
-            <w:r>
-              <w:t>Quality Coordinator   Name: ________   Signature: ________</w:t>
-            </w:r>
-          </w:p>
-        </w:tc>
-        <w:tc>
-          <w:tcPr>
-            <w:tcW w:type="dxa" w:w="2160"/>
-          </w:tcPr>
-          <w:p>
-            <w:r>
-              <w:t>Approved By</w:t>
-            </w:r>
-          </w:p>
-        </w:tc>
-        <w:tc>
-          <w:tcPr>
-            <w:tcW w:type="dxa" w:w="2160"/>
-          </w:tcPr>
-          <w:p>
-            <w:r>
-              <w:t>Medical Superintendent   Name: ________   Signature: ________</w:t>
-            </w:r>
-          </w:p>
-        </w:tc>
-      </w:tr>
     </w:tbl>
     <w:p/>
     <w:p>
@@ -206,9 +124,78 @@
         <w:t>1. Purpose</w:t>
       </w:r>
     </w:p>
+    <w:tbl>
+      <w:tblPr>
+        <w:tblStyle w:val="TableGrid"/>
+        <w:tblW w:type="auto" w:w="0"/>
+        <w:tblLook w:firstColumn="1" w:firstRow="1" w:lastColumn="0" w:lastRow="0" w:noHBand="0" w:noVBand="1" w:val="04A0"/>
+      </w:tblPr>
+      <w:tblGrid>
+        <w:gridCol w:w="8640"/>
+      </w:tblGrid>
+      <w:tr>
+        <w:tc>
+          <w:tcPr>
+            <w:tcW w:type="dxa" w:w="8640"/>
+          </w:tcPr>
+          <w:p>
+            <w:r>
+              <w:t>This SOP sets out how «Hospital Name» defines, documents and communicates the scope of healthcare services each department offers -- including what happens when a presenting patient's need falls outside that scope -- so staff, patients and referring practitioners all work from the same written statement of what a department does and does not provide.</w:t>
+            </w:r>
+          </w:p>
+        </w:tc>
+      </w:tr>
+    </w:tbl>
+    <w:p/>
+    <w:tbl>
+      <w:tblPr>
+        <w:tblStyle w:val="TableGrid"/>
+        <w:tblW w:type="auto" w:w="0"/>
+        <w:tblLook w:firstColumn="1" w:firstRow="1" w:lastColumn="0" w:lastRow="0" w:noHBand="0" w:noVBand="1" w:val="04A0"/>
+      </w:tblPr>
+      <w:tblGrid>
+        <w:gridCol w:w="8640"/>
+      </w:tblGrid>
+      <w:tr>
+        <w:tc>
+          <w:tcPr>
+            <w:tcW w:type="dxa" w:w="8640"/>
+          </w:tcPr>
+          <w:p>
+            <w:r>
+              <w:t>A patient needing a procedure the ward doesn't actually perform is brought to registration late at night. This SOP is what gets them checked against another department or referred out immediately, with the reason logged -- not accepted on a judgement call that turns out to be wrong.</w:t>
+            </w:r>
+          </w:p>
+        </w:tc>
+      </w:tr>
+    </w:tbl>
+    <w:p/>
+    <w:tbl>
+      <w:tblPr>
+        <w:tblStyle w:val="TableGrid"/>
+        <w:tblW w:type="auto" w:w="0"/>
+        <w:tblLook w:firstColumn="1" w:firstRow="1" w:lastColumn="0" w:lastRow="0" w:noHBand="0" w:noVBand="1" w:val="04A0"/>
+      </w:tblPr>
+      <w:tblGrid>
+        <w:gridCol w:w="8640"/>
+      </w:tblGrid>
+      <w:tr>
+        <w:tc>
+          <w:tcPr>
+            <w:tcW w:type="dxa" w:w="8640"/>
+          </w:tcPr>
+          <w:p>
+            <w:r>
+              <w:t>We do this because a department whose real capability was never written down can end up accepting a patient it cannot safely manage. Writing down what a department can and cannot do is what keeps that decision from being made in the moment, under pressure, by whoever happens to be on duty.</w:t>
+            </w:r>
+          </w:p>
+        </w:tc>
+      </w:tr>
+    </w:tbl>
+    <w:p/>
     <w:p>
       <w:r>
-        <w:t>This SOP sets out how «Hospital Name» defines, documents, and communicates the scope of healthcare services offered by each department — including what happens when a presenting patient's need falls outside that scope — so that staff, patients and referring practitioners all work from the same written statement of what a department actually does and does not provide.</w:t>
+        <w:t>To define how «Hospital Name» defines, documents and communicates the scope of healthcare services offered by each department, including how an out-of-scope presentation is handled.</w:t>
       </w:r>
     </w:p>
     <w:p>
@@ -221,7 +208,18 @@
     </w:p>
     <w:p>
       <w:r>
-        <w:t>This SOP applies to every clinical and diagnostic department at «Hospital Name», the admission/registration desk that relies on it, and the «Medical Superintendent» who approves each scope statement.</w:t>
+        <w:rPr>
+          <w:i/>
+        </w:rPr>
+        <w:t xml:space="preserve">Why: </w:t>
+      </w:r>
+      <w:r>
+        <w:t>so registration staff and every clinical/diagnostic department work from the same written statement, not an assumption.</w:t>
+      </w:r>
+    </w:p>
+    <w:p>
+      <w:r>
+        <w:t>Applies to every clinical and diagnostic department, the admission/registration desk, and the Medical Superintendent who approves each scope statement.</w:t>
       </w:r>
     </w:p>
     <w:p>
@@ -235,12 +233,23 @@
     <w:p>
       <w:r>
         <w:rPr>
+          <w:i/>
+        </w:rPr>
+        <w:t xml:space="preserve">Why: </w:t>
+      </w:r>
+      <w:r>
+        <w:t>a scope statement nobody drafted, approved or checked at the door is a guess, not a safeguard.</w:t>
+      </w:r>
+    </w:p>
+    <w:p>
+      <w:r>
+        <w:rPr>
           <w:b/>
         </w:rPr>
         <w:t xml:space="preserve">Department Heads: </w:t>
       </w:r>
       <w:r>
-        <w:t>draft their department's scope-of-service statement, flag any temporary or permanent change in capability, and confirm every out-of-scope presentation in their department is logged.</w:t>
+        <w:t>Draft their department's scope-of-service statement, flag any change in capability, and confirm every out-of-scope presentation is logged.</w:t>
       </w:r>
     </w:p>
     <w:p>
@@ -251,7 +260,7 @@
         <w:t xml:space="preserve">Medical Superintendent: </w:t>
       </w:r>
       <w:r>
-        <w:t>approves each scope statement, keeps the master list current, and decides how an out-of-scope presentation is handled when it is not covered by existing guidance.</w:t>
+        <w:t>Approves each scope statement, keeps the master list current, and decides how an uncovered out-of-scope presentation is handled.</w:t>
       </w:r>
     </w:p>
     <w:p>
@@ -262,7 +271,7 @@
         <w:t xml:space="preserve">Registration Staff: </w:t>
       </w:r>
       <w:r>
-        <w:t>check the current scope-of-service register before accepting a non-emergency patient.</w:t>
+        <w:t>Check the current scope-of-service register before accepting a non-emergency patient.</w:t>
       </w:r>
     </w:p>
     <w:p>
@@ -270,7 +279,7 @@
         <w:pStyle w:val="Heading1"/>
       </w:pPr>
       <w:r>
-        <w:t>4. Procedure</w:t>
+        <w:t>4. What to do</w:t>
       </w:r>
     </w:p>
     <w:p>
@@ -278,28 +287,28 @@
         <w:pStyle w:val="Heading2"/>
       </w:pPr>
       <w:r>
-        <w:t>4.1 Define and document scope</w:t>
+        <w:t>Define and document scope</w:t>
       </w:r>
     </w:p>
     <w:p>
       <w:r>
         <w:rPr>
-          <w:b/>
+          <w:i/>
         </w:rPr>
-        <w:t xml:space="preserve">Why this step matters: </w:t>
+        <w:t xml:space="preserve">Why: </w:t>
       </w:r>
       <w:r>
-        <w:t>A department whose actual capability was never written down can end up accepting a patient it cannot safely manage — the scope statement is what stops that from being a judgement call made in the moment.</w:t>
+        <w:t>A department whose actual capability was never written down can end up accepting a patient it cannot safely manage -- the scope statement is what stops that from being a judgement call made in the moment.</w:t>
       </w:r>
     </w:p>
     <w:p>
       <w:r>
-        <w:t>1. Each department head documents the services the department provides, including any defined limits (e.g. age range, case complexity, procedures not offered in-house).</w:t>
+        <w:t>Each department head documents the services the department provides, including any defined limits (age range, case complexity, procedures not offered in-house).</w:t>
       </w:r>
     </w:p>
     <w:p>
       <w:r>
-        <w:t>2. The Medical Superintendent approves the statement before it takes effect. (Record 1)</w:t>
+        <w:t>The Medical Superintendent approves the statement before it takes effect.</w:t>
       </w:r>
     </w:p>
     <w:p>
@@ -307,28 +316,28 @@
         <w:pStyle w:val="Heading2"/>
       </w:pPr>
       <w:r>
-        <w:t>4.2 Communicate and review</w:t>
+        <w:t>Communicate and review</w:t>
       </w:r>
     </w:p>
     <w:p>
       <w:r>
         <w:rPr>
-          <w:b/>
+          <w:i/>
         </w:rPr>
-        <w:t xml:space="preserve">Why this step matters: </w:t>
+        <w:t xml:space="preserve">Why: </w:t>
       </w:r>
       <w:r>
-        <w:t>A scope statement the registration desk has never seen does not actually prevent a mismatched admission — it has to reach the people making the day-to-day decision.</w:t>
+        <w:t>A scope statement the registration desk has never seen does not actually prevent a mismatched admission -- it has to reach the people making the day-to-day decision.</w:t>
       </w:r>
     </w:p>
     <w:p>
       <w:r>
-        <w:t>1. The approved scope is communicated to registration/admission staff and displayed or made available within the department.</w:t>
+        <w:t>The approved scope is communicated to registration/admission staff and displayed or made available within the department.</w:t>
       </w:r>
     </w:p>
     <w:p>
       <w:r>
-        <w:t>2. Scope statements are reviewed at least annually, or immediately when a department's capability changes, including a temporary reduction (e.g. equipment down, specialist on leave). (Record 1)</w:t>
+        <w:t>Scope statements are reviewed at least annually, or immediately when a department's capability changes, including a temporary reduction such as equipment down or a specialist on leave.</w:t>
       </w:r>
     </w:p>
     <w:p>
@@ -336,28 +345,28 @@
         <w:pStyle w:val="Heading2"/>
       </w:pPr>
       <w:r>
-        <w:t>4.3 Handle a presentation that falls outside current scope</w:t>
+        <w:t>Handle a presentation that falls outside current scope</w:t>
       </w:r>
     </w:p>
     <w:p>
       <w:r>
         <w:rPr>
-          <w:b/>
+          <w:i/>
         </w:rPr>
-        <w:t xml:space="preserve">Why this step matters: </w:t>
+        <w:t xml:space="preserve">Why: </w:t>
       </w:r>
       <w:r>
-        <w:t>A patient who needs something the department genuinely cannot provide still has to leave with a documented plan, not just a verbal 'we don't do that here' — otherwise the scope statement protects the hospital's paperwork without protecting the patient.</w:t>
+        <w:t>A patient who needs something the department genuinely cannot provide still has to leave with a documented plan, not just a verbal 'we don't do that here' -- otherwise the scope statement protects the hospital's paperwork without protecting the patient.</w:t>
       </w:r>
     </w:p>
     <w:p>
       <w:r>
-        <w:t>1. When a presenting patient's need is outside the department's documented scope, registration or the treating clinician checks whether any other department at «Hospital Name» can provide it before referring out.</w:t>
+        <w:t>When a presenting patient's need is outside the department's documented scope, registration or the treating clinician checks whether any other department can provide it before referring out.</w:t>
       </w:r>
     </w:p>
     <w:p>
       <w:r>
-        <w:t>2. If the organisation genuinely cannot provide the service, the patient is referred or transferred per the Transfer-In, Transfer-Out and Referral SOP (AAC.2.f), and the presentation is logged with the reason and the referral given. (Record 2)</w:t>
+        <w:t>If the organisation genuinely cannot provide the service, the patient is referred or transferred per the hospital's transfer and referral procedure, and the presentation is logged with the reason and the referral given.</w:t>
       </w:r>
     </w:p>
     <w:p>
@@ -378,7 +387,7 @@
         <w:pStyle w:val="Heading1"/>
       </w:pPr>
       <w:r>
-        <w:t>6. Related Documents</w:t>
+        <w:t>6. Related SOPs</w:t>
       </w:r>
     </w:p>
     <w:p>
@@ -386,7 +395,7 @@
         <w:pStyle w:val="ListParagraph"/>
       </w:pPr>
       <w:r>
-        <w:t>Policy on Access, Registration, Admission and Continuity of Care (AAC.1) — this SOP operationalises step 5.3</w:t>
+        <w:t>Policy on Access, Registration, Admission and Continuity of Care (AAC.1)</w:t>
       </w:r>
     </w:p>
     <w:p>
@@ -399,10 +408,20 @@
     </w:p>
     <w:p>
       <w:pPr>
-        <w:pStyle w:val="ListParagraph"/>
+        <w:pStyle w:val="Heading1"/>
       </w:pPr>
       <w:r>
-        <w:t>Required Records — AAC.1.c (see AAC.1 Records folder)</w:t>
+        <w:t>7. Review</w:t>
+      </w:r>
+    </w:p>
+    <w:p>
+      <w:r>
+        <w:t>This SOP is reviewed at least annually by the Quality Coordinator together with the Medical Superintendent, and sooner if a department's capability changes or an out-of-scope presentation reveals a gap.</w:t>
+      </w:r>
+    </w:p>
+    <w:p>
+      <w:r>
+        <w:br w:type="page"/>
       </w:r>
     </w:p>
     <w:p>
@@ -410,17 +429,71 @@
         <w:pStyle w:val="Heading1"/>
       </w:pPr>
       <w:r>
-        <w:t>7. Where This SOP's Requirements Come From (Verified Sources)</w:t>
+        <w:t>Appendix — NABH Standard Cross-Reference and Evidence Basis</w:t>
+      </w:r>
+    </w:p>
+    <w:p>
+      <w:r>
+        <w:t>For the Quality Coordinator and NABH assessment use only. The reasoning and real-world triggers for each requirement are already in the body above -- this appendix adds only what the body deliberately leaves out: the exact objective-element code, how this SOP's scope is kept separate from neighbouring standards, and the verified technical source for anything cited.</w:t>
+      </w:r>
+    </w:p>
+    <w:p>
+      <w:pPr>
+        <w:pStyle w:val="Heading2"/>
+      </w:pPr>
+      <w:r>
+        <w:t>Define and document scope — AAC.1.c</w:t>
+      </w:r>
+    </w:p>
+    <w:p>
+      <w:pPr>
+        <w:pStyle w:val="Heading2"/>
+      </w:pPr>
+      <w:r>
+        <w:t>Communicate and review — AAC.1.c</w:t>
+      </w:r>
+    </w:p>
+    <w:p>
+      <w:pPr>
+        <w:pStyle w:val="Heading2"/>
+      </w:pPr>
+      <w:r>
+        <w:t>Handle a presentation that falls outside current scope — AAC.1.c</w:t>
+      </w:r>
+    </w:p>
+    <w:p>
+      <w:r>
+        <w:rPr>
+          <w:i/>
+        </w:rPr>
+        <w:t>Boundary with other standards:</w:t>
       </w:r>
     </w:p>
     <w:p>
       <w:pPr>
         <w:pStyle w:val="ListParagraph"/>
-        <w:spacing w:after="240" w:before="80"/>
-        <w:contextualSpacing w:val="0"/>
       </w:pPr>
       <w:r>
-        <w:t xml:space="preserve">• National Accreditation Board for Hospitals and Healthcare Providers. (2022). Standards for Small Healthcare Organisations (3rd ed.). </w:t>
+        <w:t>• A referral or transfer carried out under this step follows the Transfer-In, Transfer-Out and Referral SOP (AAC.2.f) -- this SOP owns the scope decision, not the transfer mechanics.</w:t>
+      </w:r>
+    </w:p>
+    <w:p>
+      <w:pPr>
+        <w:pStyle w:val="Heading2"/>
+      </w:pPr>
+      <w:r>
+        <w:t>Full reference list</w:t>
+      </w:r>
+    </w:p>
+    <w:p>
+      <w:pPr>
+        <w:pStyle w:val="ListParagraph"/>
+      </w:pPr>
+      <w:r>
+        <w:t xml:space="preserve">• </w:t>
+      </w:r>
+      <w:r>
+        <w:t xml:space="preserve">National Accreditation Board for Hospitals and Healthcare Providers. (2022). Standards for Small Healthcare Organisations (3rd ed.). </w:t>
       </w:r>
       <w:hyperlink r:id="rId9">
         <w:r>
@@ -433,19 +506,6 @@
       </w:hyperlink>
       <w:r>
         <w:t>. Access, Assessment and Care of Patients chapter, standard AAC.1.</w:t>
-      </w:r>
-    </w:p>
-    <w:p>
-      <w:pPr>
-        <w:pStyle w:val="Heading1"/>
-      </w:pPr>
-      <w:r>
-        <w:t>8. Review</w:t>
-      </w:r>
-    </w:p>
-    <w:p>
-      <w:r>
-        <w:t>This SOP is reviewed at least annually by the Quality Coordinator together with the Medical Superintendent, and sooner if a department's capability changes or an out-of-scope presentation reveals a gap.</w:t>
       </w:r>
     </w:p>
     <w:sectPr>

</xml_diff>

<commit_message>
Rebuild AAC SOPs — remove italic Why: label (template fix retrofit)
Reruns build_aac_sops_v2.py against the already-fixed
sop_record_common.py so AAC's SOP body text drops the "Why:" label
in the same way PSQ/HIC/IMS already do. No content or source
changes — mechanical re-render only.

Co-Authored-By: Claude Sonnet 5 <noreply@anthropic.com>
Claude-Session: https://claude.ai/code/session_016VFLsECWt4VArpBiaqgrgF
</commit_message>
<xml_diff>
--- a/policies/build/sop_record_masters/AAC/SOP_AAC.1.c_scope_of_services.docx
+++ b/policies/build/sop_record_masters/AAC/SOP_AAC.1.c_scope_of_services.docx
@@ -208,12 +208,6 @@
     </w:p>
     <w:p>
       <w:r>
-        <w:rPr>
-          <w:i/>
-        </w:rPr>
-        <w:t xml:space="preserve">Why: </w:t>
-      </w:r>
-      <w:r>
         <w:t>so registration staff and every clinical/diagnostic department work from the same written statement, not an assumption.</w:t>
       </w:r>
     </w:p>
@@ -231,12 +225,6 @@
       </w:r>
     </w:p>
     <w:p>
-      <w:r>
-        <w:rPr>
-          <w:i/>
-        </w:rPr>
-        <w:t xml:space="preserve">Why: </w:t>
-      </w:r>
       <w:r>
         <w:t>a scope statement nobody drafted, approved or checked at the door is a guess, not a safeguard.</w:t>
       </w:r>
@@ -292,12 +280,6 @@
     </w:p>
     <w:p>
       <w:r>
-        <w:rPr>
-          <w:i/>
-        </w:rPr>
-        <w:t xml:space="preserve">Why: </w:t>
-      </w:r>
-      <w:r>
         <w:t>A department whose actual capability was never written down can end up accepting a patient it cannot safely manage -- the scope statement is what stops that from being a judgement call made in the moment.</w:t>
       </w:r>
     </w:p>
@@ -321,12 +303,6 @@
     </w:p>
     <w:p>
       <w:r>
-        <w:rPr>
-          <w:i/>
-        </w:rPr>
-        <w:t xml:space="preserve">Why: </w:t>
-      </w:r>
-      <w:r>
         <w:t>A scope statement the registration desk has never seen does not actually prevent a mismatched admission -- it has to reach the people making the day-to-day decision.</w:t>
       </w:r>
     </w:p>
@@ -349,12 +325,6 @@
       </w:r>
     </w:p>
     <w:p>
-      <w:r>
-        <w:rPr>
-          <w:i/>
-        </w:rPr>
-        <w:t xml:space="preserve">Why: </w:t>
-      </w:r>
       <w:r>
         <w:t>A patient who needs something the department genuinely cannot provide still has to leave with a documented plan, not just a verbal 'we don't do that here' -- otherwise the scope statement protects the hospital's paperwork without protecting the patient.</w:t>
       </w:r>

</xml_diff>